<commit_message>
docs: complete workflow guidance and evidence chain
</commit_message>
<xml_diff>
--- a/projects/2026-cumcm/solutions/problem-b-radio-interference/paper/paper.docx
+++ b/projects/2026-cumcm/solutions/problem-b-radio-interference/paper/paper.docx
@@ -9538,7 +9538,7 @@
           <w:color w:val="000000"/>
           <w:sz w:val="21"/>
         </w:rPr>
-        <w:t xml:space="preserve">解析几何使用直线/圆弧精确边界和双精度安全余量；覆盖构造除解析证明外，还在密集确定性节点上检查。离线模拟器复现移动、换台、检测、清除、半平面辐射和同地点固定误差规则；199</w:t>
+        <w:t>解析几何使用直线/圆弧精确边界和双精度安全余量；覆盖构造除解析证明外，还在密集确定性节点上检查。离线模拟器复现移动、换台、检测、清除、半平面辐射和同地点固定误差规则</w:t>
       </w:r>
       <w:r>
         <w:rPr>
@@ -9546,7 +9546,6 @@
           <w:color w:val="000000"/>
           <w:sz w:val="21"/>
         </w:rPr>
-        <w:t xml:space="preserve"> </w:t>
       </w:r>
       <w:r>
         <w:rPr>
@@ -9554,7 +9553,7 @@
           <w:color w:val="000000"/>
           <w:sz w:val="21"/>
         </w:rPr>
-        <w:t xml:space="preserve">s官方计时示例逐步一致。HTTP客户端串行发送动作，网络重试复用完全相同的请求体和</w:t>
+        <w:t>。HTTP客户端串行发送动作，网络重试复用完全相同的请求体和</w:t>
       </w:r>
       <w:r>
         <w:rPr>
@@ -9630,7 +9629,7 @@
           <w:color w:val="000000"/>
           <w:sz w:val="21"/>
         </w:rPr>
-        <w:t xml:space="preserve">项目共32项测试通过。既有Q1/Q2证据还包含180次几何更新、27009次Q2合法角度更新、独立GEOS内外夹逼和连续返回角分箱加密；本轮24个端到端案例全部清除，最大虚拟时间27209.86</w:t>
+        <w:t>既有Q1/Q2证据还包含180次几何更新、27009次Q2合法角度更新、独立GEOS内外夹逼和连续返回角分箱加密；本轮24个端到端案例全部清除，最大虚拟时间27209.86</w:t>
       </w:r>
       <w:r>
         <w:rPr>

</xml_diff>